<commit_message>
Update BD Leads presentation - clean formatting, concise
Consistent bullet formatting, no em dashes, everything framed under
BD Leads, cut from 11 pages to ~5.

https://claude.ai/code/session_01DuuAHz1iFrHfmRnXwNBUPX
</commit_message>
<xml_diff>
--- a/VMA_Group_BD_Leads_Build_Complete.docx
+++ b/VMA_Group_BD_Leads_Build_Complete.docx
@@ -10,21 +10,12 @@
         <w:rPr>
           <w:color w:val="1B2A4A"/>
         </w:rPr>
-        <w:t>VMA Group — BD Intelligence Platform</w:t>
+        <w:t>VMA Group - BD Leads Intelligence</w:t>
       </w:r>
     </w:p>
     <w:p>
       <w:r>
-        <w:rPr>
-          <w:i/>
-          <w:sz w:val="24"/>
-        </w:rPr>
-        <w:t>A complete outline of every element built, tailored and curated for VMA’s Business Development leads.</w:t>
-      </w:r>
-    </w:p>
-    <w:p>
-      <w:r>
-        <w:t>This platform is not a simple keyword scraper or a standard job-board monitor. It is a custom-built, multi-source business development engine designed to give VMA’s consultants a decisive advantage. By tracking shifts across the entire UK market, the system identifies high-value recruitment opportunities before competitors even know they exist. It automatically cross-references corporate news, market data, job movements, regulatory filings, charity registers, government procurement, and more — delivering a daily, prioritised shortlist of precisely which decision-makers to call and exactly what to say to them.</w:t>
+        <w:t>This document outlines every element built into the BD Leads section of VMA's intelligence platform. The system scours 30+ public data sources every morning, qualifies every opportunity through a rigorous multi-layer screen, and delivers a prioritised shortlist of who to call and what to say to them - before competitors even know the opportunity exists.</w:t>
       </w:r>
     </w:p>
     <w:p>
@@ -35,67 +26,12 @@
         <w:rPr>
           <w:color w:val="1B2A4A"/>
         </w:rPr>
-        <w:t>1. Seven Distinct Categories of BD Lead</w:t>
+        <w:t>What the BD Leads Section Covers</w:t>
       </w:r>
     </w:p>
     <w:p>
       <w:r>
-        <w:t>Instead of looking at just one type of lead, the system continuously tracks seven distinct categories of market activity to keep the pipeline full:</w:t>
-      </w:r>
-    </w:p>
-    <w:p>
-      <w:r>
-        <w:rPr>
-          <w:b/>
-        </w:rPr>
-        <w:t xml:space="preserve">1. Live Job Postings: </w:t>
-      </w:r>
-      <w:r>
-        <w:t>Real-time monitoring of live vacancies across major job boards matching senior communications criteria, ranked by relevance and cleaned daily. Leads auto-expire after seven days so the dashboard never shows stale postings.</w:t>
-      </w:r>
-    </w:p>
-    <w:p>
-      <w:r>
-        <w:rPr>
-          <w:b/>
-        </w:rPr>
-        <w:t xml:space="preserve">2. Pre-Market Prediction Signals: </w:t>
-      </w:r>
-      <w:r>
-        <w:t>Intelligent monitoring of major corporate events — leadership changes, company crises, M&amp;A activity, regulatory action — that historically indicate a senior communications hire is about to happen, weeks or months before any role is advertised. These sit in a rolling 30-day pipeline (extended to 90 days once a consultant marks a lead as “followed up”).</w:t>
-      </w:r>
-    </w:p>
-    <w:p>
-      <w:r>
-        <w:rPr>
-          <w:b/>
-        </w:rPr>
-        <w:t xml:space="preserve">3. Funding &amp; Capital Raises: </w:t>
-      </w:r>
-      <w:r>
-        <w:t>Tracking private growth companies securing major funding rounds (≥20m). These companies typically build out senior communications functions roughly six months post-funding. Detected from news intelligence and enriched with Crunchbase investment data for broader coverage.</w:t>
-      </w:r>
-    </w:p>
-    <w:p>
-      <w:r>
-        <w:rPr>
-          <w:b/>
-        </w:rPr>
-        <w:t xml:space="preserve">4. Vacated Seats &amp; Executive Moves: </w:t>
-      </w:r>
-      <w:r>
-        <w:t>When a senior communications professional changes jobs, the system flags the seat they left as an immediate replacement opportunity, while marking their new employer as a target to watch for structural team changes. Departure-only announcements — the cleanest backfill signal — are also caught. A 90-day suppression window prevents the same move from re-firing.</w:t>
-      </w:r>
-    </w:p>
-    <w:p>
-      <w:r>
-        <w:rPr>
-          <w:b/>
-        </w:rPr>
-        <w:t xml:space="preserve">5. The BD Calendar (Auto-Updating): </w:t>
-      </w:r>
-      <w:r>
-        <w:t>Three distinct calendar tools, all auto-updating daily from real public sources:</w:t>
+        <w:t>The BD Leads section continuously tracks seven distinct categories of opportunity:</w:t>
       </w:r>
     </w:p>
     <w:p>
@@ -103,13 +39,7 @@
         <w:pStyle w:val="ListBullet"/>
       </w:pPr>
       <w:r>
-        <w:rPr>
-          <w:b/>
-        </w:rPr>
-        <w:t>Predictable, date-driven windows where statute or regulation fixes the timing. Examples: FCA Consumer Duty board-report deadlines, UK Sustainability Reporting Standards first-cycle build-up, post-Spending-Review machinery-of-government reshuffles. Each window resolves to named watchlist companies in scope, the exact comms seat the deadline creates demand for, and a one-line pitch angle.</w:t>
-      </w:r>
-      <w:r>
-        <w:t xml:space="preserve">Placement Windows: </w:t>
+        <w:t>Live Job Postings - Real-time monitoring of senior communications vacancies across major UK job boards, ranked by relevance and auto-cleared after seven days</w:t>
       </w:r>
     </w:p>
     <w:p>
@@ -117,13 +47,7 @@
         <w:pStyle w:val="ListBullet"/>
       </w:pPr>
       <w:r>
-        <w:rPr>
-          <w:b/>
-        </w:rPr>
-        <w:t>Industry events, conferences and networking moments relevant to senior comms recruitment.</w:t>
-      </w:r>
-      <w:r>
-        <w:t xml:space="preserve">Events &amp; Networking: </w:t>
+        <w:t>Pre-Market Prediction Signals - Corporate events (leadership changes, crises, M&amp;A) that predict a senior hire is coming, weeks before any role is advertised</w:t>
       </w:r>
     </w:p>
     <w:p>
@@ -131,24 +55,7 @@
         <w:pStyle w:val="ListBullet"/>
       </w:pPr>
       <w:r>
-        <w:rPr>
-          <w:b/>
-        </w:rPr>
-        <w:t>Public-sector procurement and executive-search framework re-tenders and eligibility windows.</w:t>
-      </w:r>
-      <w:r>
-        <w:t xml:space="preserve">Framework Eligibility: </w:t>
-      </w:r>
-    </w:p>
-    <w:p>
-      <w:r>
-        <w:rPr>
-          <w:b/>
-        </w:rPr>
-        <w:t xml:space="preserve">6. Water Special-Administration Watch: </w:t>
-      </w:r>
-      <w:r>
-        <w:t>A bespoke, high-value detector covering the ∼17 regulated water and sewerage companies in England &amp; Wales. When a water monopoly approaches or enters the Special Administration Regime (the Thames Water 2024–26 path), it triggers an immediate, large, time-critical senior comms surge: crisis communications, regulatory/stakeholder communications, restructuring and change communications — at the company AND at the appointed special administrator and its advisers. The system detects two stages:</w:t>
+        <w:t>Funding and Capital Raises - Private companies securing significant funding rounds, which typically build out senior communications teams within six months</w:t>
       </w:r>
     </w:p>
     <w:p>
@@ -156,13 +63,7 @@
         <w:pStyle w:val="ListBullet"/>
       </w:pPr>
       <w:r>
-        <w:rPr>
-          <w:b/>
-        </w:rPr>
-        <w:t>Special administrator appointed, Defra invoking the regime. The permanent reputation/stakeholder-comms hire follows — this is the trigger to win the retained mandate now.</w:t>
-      </w:r>
-      <w:r>
-        <w:t xml:space="preserve">SAR Live / Imminent (High Priority): </w:t>
+        <w:t>Vacated Seats and Executive Moves - When a senior communications professional changes jobs, the seat they left is flagged as a replacement search and their new employer is flagged for team restructuring</w:t>
       </w:r>
     </w:p>
     <w:p>
@@ -170,24 +71,23 @@
         <w:pStyle w:val="ListBullet"/>
       </w:pPr>
       <w:r>
-        <w:rPr>
-          <w:b/>
-        </w:rPr>
-        <w:t>Ofwat resilience action, cash lock-up, sub-investment-grade downgrade, going-concern doubt, failed equity raise. SAR risk is building; comms capacity expands ahead of any step.</w:t>
-      </w:r>
-      <w:r>
-        <w:t xml:space="preserve">Financial-Resilience Watch (Medium Priority): </w:t>
+        <w:t>BD Calendar - Three auto-updating tools: Placement Windows (date-driven regulatory deadlines), Events and Networking, and Framework Eligibility (public-sector re-tenders)</w:t>
       </w:r>
     </w:p>
     <w:p>
+      <w:pPr>
+        <w:pStyle w:val="ListBullet"/>
+      </w:pPr>
       <w:r>
-        <w:rPr>
-          <w:b/>
-        </w:rPr>
-        <w:t xml:space="preserve">7. Contract-End &amp; Re-Tender Windows: </w:t>
+        <w:t>Water Special-Administration Watch - Bespoke coverage of the 17 regulated water companies in England and Wales, detecting both live SAR events and early financial-resilience warnings that precede them</w:t>
       </w:r>
+    </w:p>
+    <w:p>
+      <w:pPr>
+        <w:pStyle w:val="ListBullet"/>
+      </w:pPr>
       <w:r>
-        <w:t>A proactive leading indicator that complements the reactive “contract loss” predictor. When a flagship contract approaches its end date or a major project nears hand-over, both the incumbent and the contracting authority review their comms capacity. The system detects these windows from Find a Tender notices and project-completion press months before any contract-loss announcement. Watchlist-gated so only relevant employers surface.</w:t>
+        <w:t>Contract-End and Re-Tender Windows - Proactive detection of contracts approaching expiry, months before any public announcement, covering both the incumbent and the contracting authority</w:t>
       </w:r>
     </w:p>
     <w:p>
@@ -198,20 +98,12 @@
         <w:rPr>
           <w:color w:val="1B2A4A"/>
         </w:rPr>
-        <w:t>2. Data Sources Scoured Across the Internet</w:t>
+        <w:t>Where the Data Comes From</w:t>
       </w:r>
     </w:p>
     <w:p>
       <w:r>
-        <w:t>The system draws from over 30 distinct data sources spanning regulatory filings, news intelligence, job boards, government registers, and market indices. Every source is scoured automatically on each daily run.</w:t>
-      </w:r>
-    </w:p>
-    <w:p>
-      <w:r>
-        <w:rPr>
-          <w:b/>
-        </w:rPr>
-        <w:t>Regulatory &amp; Corporate Filings</w:t>
+        <w:t>Every source below is scoured automatically on each daily run.</w:t>
       </w:r>
     </w:p>
     <w:p>
@@ -219,13 +111,7 @@
         <w:pStyle w:val="ListBullet"/>
       </w:pPr>
       <w:r>
-        <w:rPr>
-          <w:b/>
-        </w:rPr>
-        <w:t>Director appointments and departures, filing events, charges, persons with significant control changes, officer tenure analysis. Rotating daily scans across the full watchlist (∼550 companies), plus a real-time streaming firehose for instant detection.</w:t>
-      </w:r>
-      <w:r>
-        <w:t xml:space="preserve">Companies House: </w:t>
+        <w:t>Companies House - Director appointments/departures, filing events, charges, significant-control changes, officer tenure analysis, plus a real-time streaming feed</w:t>
       </w:r>
     </w:p>
     <w:p>
@@ -233,13 +119,7 @@
         <w:pStyle w:val="ListBullet"/>
       </w:pPr>
       <w:r>
-        <w:rPr>
-          <w:b/>
-        </w:rPr>
-        <w:t>Regulatory news service — the official disclosure channel for listed companies. Leadership changes, profit warnings, M&amp;A, funding, results.</w:t>
-      </w:r>
-      <w:r>
-        <w:t xml:space="preserve">London Stock Exchange / RNS (Investegate): </w:t>
+        <w:t>London Stock Exchange / RNS (Investegate) - Official regulatory news: leadership changes, profit warnings, M&amp;A, funding, results</w:t>
       </w:r>
     </w:p>
     <w:p>
@@ -247,13 +127,7 @@
         <w:pStyle w:val="ListBullet"/>
       </w:pPr>
       <w:r>
-        <w:rPr>
-          <w:b/>
-        </w:rPr>
-        <w:t>8-K filings for US-listed companies with UK operations (cross-border coverage).</w:t>
-      </w:r>
-      <w:r>
-        <w:t xml:space="preserve">SEC EDGAR: </w:t>
+        <w:t>SEC EDGAR - US 8-K filings for companies with UK operations</w:t>
       </w:r>
     </w:p>
     <w:p>
@@ -261,21 +135,7 @@
         <w:pStyle w:val="ListBullet"/>
       </w:pPr>
       <w:r>
-        <w:rPr>
-          <w:b/>
-        </w:rPr>
-        <w:t>Individual RSS feeds from every major UK regulator — enforcement actions, consultations, and regulatory changes that drive comms hiring.</w:t>
-      </w:r>
-      <w:r>
-        <w:t xml:space="preserve">FCA, Ofcom, Ofgem, Ofwat, ICO, CMA: </w:t>
-      </w:r>
-    </w:p>
-    <w:p>
-      <w:r>
-        <w:rPr>
-          <w:b/>
-        </w:rPr>
-        <w:t>Government &amp; Public Sector</w:t>
+        <w:t>UK Regulators - Individual feeds from the FCA, Ofcom, Ofgem, Ofwat, ICO and CMA</w:t>
       </w:r>
     </w:p>
     <w:p>
@@ -283,13 +143,7 @@
         <w:pStyle w:val="ListBullet"/>
       </w:pPr>
       <w:r>
-        <w:rPr>
-          <w:b/>
-        </w:rPr>
-        <w:t>The UK government’s procurement notice service — framework re-tenders, contract awards, and contract-end notices.</w:t>
-      </w:r>
-      <w:r>
-        <w:t xml:space="preserve">Find a Tender: </w:t>
+        <w:t>Find a Tender - UK government procurement notices, framework re-tenders, contract awards and contract-end notices</w:t>
       </w:r>
     </w:p>
     <w:p>
@@ -297,13 +151,7 @@
         <w:pStyle w:val="ListBullet"/>
       </w:pPr>
       <w:r>
-        <w:rPr>
-          <w:b/>
-        </w:rPr>
-        <w:t>Devolved-nation procurement feeds.</w:t>
-      </w:r>
-      <w:r>
-        <w:t xml:space="preserve">Public Contracts Scotland, Sell2Wales, eTendersNI: </w:t>
+        <w:t>Public Contracts Scotland, Sell2Wales, eTendersNI - Devolved-nation procurement feeds</w:t>
       </w:r>
     </w:p>
     <w:p>
@@ -311,13 +159,7 @@
         <w:pStyle w:val="ListBullet"/>
       </w:pPr>
       <w:r>
-        <w:rPr>
-          <w:b/>
-        </w:rPr>
-        <w:t>Senior public-sector communications roles.</w:t>
-      </w:r>
-      <w:r>
-        <w:t xml:space="preserve">Civil Service Jobs: </w:t>
+        <w:t>Civil Service Jobs - Senior public-sector communications roles</w:t>
       </w:r>
     </w:p>
     <w:p>
@@ -325,21 +167,7 @@
         <w:pStyle w:val="ListBullet"/>
       </w:pPr>
       <w:r>
-        <w:rPr>
-          <w:b/>
-        </w:rPr>
-        <w:t>Trustee-board changes at registered charities — a new chair or trustee appointment at a major charity is a governance trigger for comms review.</w:t>
-      </w:r>
-      <w:r>
-        <w:t xml:space="preserve">Charity Commission: </w:t>
-      </w:r>
-    </w:p>
-    <w:p>
-      <w:r>
-        <w:rPr>
-          <w:b/>
-        </w:rPr>
-        <w:t>News &amp; Event Intelligence</w:t>
+        <w:t>Charity Commission - Trustee-board changes at registered charities</w:t>
       </w:r>
     </w:p>
     <w:p>
@@ -347,13 +175,7 @@
         <w:pStyle w:val="ListBullet"/>
       </w:pPr>
       <w:r>
-        <w:rPr>
-          <w:b/>
-        </w:rPr>
-        <w:t>The world’s largest open news graph. Scoured with 60+ tailored queries covering both live comms-role mentions and a 90-day predictive sweep for CEO/CFO/Chair changes, M&amp;A, IPO filings, regulatory action, contract losses, activist stakes, restructures, and comms-leader departures.</w:t>
-      </w:r>
-      <w:r>
-        <w:t xml:space="preserve">GDELT (Global Database of Events, Tone and Language): </w:t>
+        <w:t>GDELT - The world's largest open news graph, scoured with 60+ tailored queries covering live mentions and a 90-day predictive sweep</w:t>
       </w:r>
     </w:p>
     <w:p>
@@ -361,13 +183,7 @@
         <w:pStyle w:val="ListBullet"/>
       </w:pPr>
       <w:r>
-        <w:rPr>
-          <w:b/>
-        </w:rPr>
-        <w:t>A redundant predictive lane using the same trigger phrasing as GDELT, ensuring no single source failure silently costs the pipeline leads.</w:t>
-      </w:r>
-      <w:r>
-        <w:t xml:space="preserve">Google News RSS: </w:t>
+        <w:t>Google News RSS - A redundant news lane ensuring no single source failure silently costs leads</w:t>
       </w:r>
     </w:p>
     <w:p>
@@ -375,21 +191,7 @@
         <w:pStyle w:val="ListBullet"/>
       </w:pPr>
       <w:r>
-        <w:rPr>
-          <w:b/>
-        </w:rPr>
-        <w:t>CorpComms Magazine, PRmoment, CIPR Influence, Ragan Communications (comms-specific); Marketing Week, The Drum, Marketing Beat (marketing-specific); Inside Housing, Utility Week, pharmaphorum, FierceBiotech (hot-sector verticals).</w:t>
-      </w:r>
-      <w:r>
-        <w:t xml:space="preserve">Trade Press: </w:t>
-      </w:r>
-    </w:p>
-    <w:p>
-      <w:r>
-        <w:rPr>
-          <w:b/>
-        </w:rPr>
-        <w:t>Job Boards &amp; Applicant Tracking Systems</w:t>
+        <w:t>Trade Press - CorpComms Magazine, PRmoment, CIPR Influence, Ragan, Marketing Week, The Drum, Inside Housing, Utility Week, pharmaphorum, FierceBiotech and others</w:t>
       </w:r>
     </w:p>
     <w:p>
@@ -397,13 +199,7 @@
         <w:pStyle w:val="ListBullet"/>
       </w:pPr>
       <w:r>
-        <w:rPr>
-          <w:b/>
-        </w:rPr>
-        <w:t>Multi-board job aggregator covering the UK market.</w:t>
-      </w:r>
-      <w:r>
-        <w:t xml:space="preserve">Adzuna: </w:t>
+        <w:t>Adzuna - Multi-board UK job aggregator</w:t>
       </w:r>
     </w:p>
     <w:p>
@@ -411,13 +207,7 @@
         <w:pStyle w:val="ListBullet"/>
       </w:pPr>
       <w:r>
-        <w:rPr>
-          <w:b/>
-        </w:rPr>
-        <w:t>Logged-off public job cards, with intelligent employer resolution (strips out aggregator names to find the real hiring company).</w:t>
-      </w:r>
-      <w:r>
-        <w:t xml:space="preserve">LinkedIn Jobs (Public): </w:t>
+        <w:t>LinkedIn Jobs - Public job cards with intelligent employer resolution</w:t>
       </w:r>
     </w:p>
     <w:p>
@@ -425,21 +215,7 @@
         <w:pStyle w:val="ListBullet"/>
       </w:pPr>
       <w:r>
-        <w:rPr>
-          <w:b/>
-        </w:rPr>
-        <w:t>Direct scraping of company career pages hosted on these applicant tracking systems — catches roles before they hit the job boards.</w:t>
-      </w:r>
-      <w:r>
-        <w:t xml:space="preserve">Greenhouse, Lever, Ashby, Workable: </w:t>
-      </w:r>
-    </w:p>
-    <w:p>
-      <w:r>
-        <w:rPr>
-          <w:b/>
-        </w:rPr>
-        <w:t>Investment &amp; Funding</w:t>
+        <w:t>Greenhouse, Lever, Ashby, Workable - Direct scraping of company career pages hosted on these systems</w:t>
       </w:r>
     </w:p>
     <w:p>
@@ -447,21 +223,7 @@
         <w:pStyle w:val="ListBullet"/>
       </w:pPr>
       <w:r>
-        <w:rPr>
-          <w:b/>
-        </w:rPr>
-        <w:t>Proactive funding-round detection, enriching the reactive news-based funding detector with structured investment data.</w:t>
-      </w:r>
-      <w:r>
-        <w:t xml:space="preserve">Crunchbase: </w:t>
-      </w:r>
-    </w:p>
-    <w:p>
-      <w:r>
-        <w:rPr>
-          <w:b/>
-        </w:rPr>
-        <w:t>Historical &amp; Technical Intelligence</w:t>
+        <w:t>Crunchbase - Structured investment data enriching the news-based funding detector</w:t>
       </w:r>
     </w:p>
     <w:p>
@@ -469,13 +231,7 @@
         <w:pStyle w:val="ListBullet"/>
       </w:pPr>
       <w:r>
-        <w:rPr>
-          <w:b/>
-        </w:rPr>
-        <w:t>Detects pre-announcement leadership departures by diffing a company’s team/leadership page against its last archived snapshot. If someone quietly disappears from the team page before any public announcement, the system catches it.</w:t>
-      </w:r>
-      <w:r>
-        <w:t xml:space="preserve">Wayback Machine (Internet Archive): </w:t>
+        <w:t>Wayback Machine - Detects leadership departures by comparing a company's team page against its last archived version, before any public announcement</w:t>
       </w:r>
     </w:p>
     <w:p>
@@ -483,21 +239,7 @@
         <w:pStyle w:val="ListBullet"/>
       </w:pPr>
       <w:r>
-        <w:rPr>
-          <w:b/>
-        </w:rPr>
-        <w:t>Detects internal-comms platform adoptions and martech stack changes (e.g. a company switching IC platforms triggers a re-tender/RFP access signal).</w:t>
-      </w:r>
-      <w:r>
-        <w:t xml:space="preserve">Technographics Fingerprinting: </w:t>
-      </w:r>
-    </w:p>
-    <w:p>
-      <w:r>
-        <w:rPr>
-          <w:b/>
-        </w:rPr>
-        <w:t>Market Health Indices (Monthly Auto-Refresh)</w:t>
+        <w:t>Technographics Fingerprinting - Detects internal-comms platform adoptions and martech stack changes that signal a re-tender</w:t>
       </w:r>
     </w:p>
     <w:p>
@@ -505,13 +247,7 @@
         <w:pStyle w:val="ListBullet"/>
       </w:pPr>
       <w:r>
-        <w:rPr>
-          <w:b/>
-        </w:rPr>
-        <w:t>The UK Permanent Placements Index — the definitive read on whether the hiring market is expanding or contracting, broken down by sector.</w:t>
-      </w:r>
-      <w:r>
-        <w:t xml:space="preserve">KPMG/REC Report on Jobs: </w:t>
+        <w:t>KPMG/REC Report on Jobs - UK Permanent Placements Index, auto-refreshed monthly</w:t>
       </w:r>
     </w:p>
     <w:p>
@@ -519,13 +255,7 @@
         <w:pStyle w:val="ListBullet"/>
       </w:pPr>
       <w:r>
-        <w:rPr>
-          <w:b/>
-        </w:rPr>
-        <w:t>Marketing-budget net balance — whether companies are increasing or cutting marketing spend.</w:t>
-      </w:r>
-      <w:r>
-        <w:t xml:space="preserve">IPA Bellwether: </w:t>
+        <w:t>IPA Bellwether - Marketing-budget net balance</w:t>
       </w:r>
     </w:p>
     <w:p>
@@ -533,13 +263,7 @@
         <w:pStyle w:val="ListBullet"/>
       </w:pPr>
       <w:r>
-        <w:rPr>
-          <w:b/>
-        </w:rPr>
-        <w:t>Global marketing-spend benchmarks.</w:t>
-      </w:r>
-      <w:r>
-        <w:t xml:space="preserve">Gartner CMO Spend Survey: </w:t>
+        <w:t>Gartner CMO Spend Survey - Global marketing-spend benchmarks</w:t>
       </w:r>
     </w:p>
     <w:p>
@@ -550,34 +274,12 @@
         <w:rPr>
           <w:color w:val="1B2A4A"/>
         </w:rPr>
-        <w:t>3. The 7-Layer Qualification Screen</w:t>
+        <w:t>How Every Lead is Qualified</w:t>
       </w:r>
     </w:p>
     <w:p>
       <w:r>
-        <w:t>Every single opportunity must pass through a strict multi-layer qualification screen before it reaches the dashboard. No single trigger is enough — the system requires signals to STACK across independent layers, with no material contradiction, before rating a lead as strong.</w:t>
-      </w:r>
-    </w:p>
-    <w:p>
-      <w:r>
-        <w:rPr>
-          <w:b/>
-        </w:rPr>
-        <w:t xml:space="preserve">Layer 0 — Target Market Fit (0–10 score): </w:t>
-      </w:r>
-      <w:r>
-        <w:t>Automatically prioritises companies on VMA’s internal watchlist, within specialist sectors, and based in the UK. Companies score higher on all three dimensions; unknown companies stay visible (to protect recall) but rank lower. Rival recruitment agencies are automatically detected and de-ranked as a conflict of interest.</w:t>
-      </w:r>
-    </w:p>
-    <w:p>
-      <w:r>
-        <w:rPr>
-          <w:b/>
-        </w:rPr>
-        <w:t xml:space="preserve">Layer 1 — Event Triggers (33 distinct types): </w:t>
-      </w:r>
-      <w:r>
-        <w:t>Flags 33 specific corporate actions that drive hiring, each weighted and categorised:</w:t>
+        <w:t>No single trigger is enough. Every opportunity must pass through a strict 7-layer screen, and signals must stack across independent layers with no material contradiction.</w:t>
       </w:r>
     </w:p>
     <w:p>
@@ -585,13 +287,7 @@
         <w:pStyle w:val="ListBullet"/>
       </w:pPr>
       <w:r>
-        <w:rPr>
-          <w:b/>
-        </w:rPr>
-        <w:t>New CHRO, Comms Director departure, IR Director change, CEO change, Chair change, CFO change.</w:t>
-      </w:r>
-      <w:r>
-        <w:t xml:space="preserve">Leadership Changes (slow decay — meaningful for ~90 days): </w:t>
+        <w:t>Layer 0 - Target Market Fit: Prioritises watchlist companies, specialist sectors and UK-based firms. Rival recruiters are automatically detected and de-ranked</w:t>
       </w:r>
     </w:p>
     <w:p>
@@ -599,13 +295,7 @@
         <w:pStyle w:val="ListBullet"/>
       </w:pPr>
       <w:r>
-        <w:rPr>
-          <w:b/>
-        </w:rPr>
-        <w:t>Funding round, IPO/listing, job-ad cluster, redundancy programme, M&amp;A, PE acquisition, activist stake, crisis event, regulator action, profit warning, restructure, ownership change, secured financing, rebrand, agency account move, framework award, hiring gap, seniority gap, framework displacement, contract loss, regulator probe, ESG/B-Corp certification.</w:t>
-      </w:r>
-      <w:r>
-        <w:t xml:space="preserve">Demand Triggers (fast decay — urgent, weeks): </w:t>
+        <w:t>Layer 1 - Event Triggers: 33 specific corporate actions that drive hiring, from leadership changes and funding rounds to redundancy programmes, activist stakes and regulatory action</w:t>
       </w:r>
     </w:p>
     <w:p>
@@ -613,13 +303,7 @@
         <w:pStyle w:val="ListBullet"/>
       </w:pPr>
       <w:r>
-        <w:rPr>
-          <w:b/>
-        </w:rPr>
-        <w:t>Internal comms platform RFP/re-tender, martech adoption.</w:t>
-      </w:r>
-      <w:r>
-        <w:t xml:space="preserve">Access Triggers: </w:t>
+        <w:t>Layer 2 - Timing: Ensures the call happens at the right moment. A "too-fresh hold" prevents calling a new CEO in their first 21 days, knowing they need 8 to 12 weeks before forming a hiring plan</w:t>
       </w:r>
     </w:p>
     <w:p>
@@ -627,79 +311,39 @@
         <w:pStyle w:val="ListBullet"/>
       </w:pPr>
       <w:r>
-        <w:rPr>
-          <w:b/>
-        </w:rPr>
-        <w:t>NED/trustee appointment, press-release velocity spike, personal brand velocity uptick, leadership tenure watch.</w:t>
-      </w:r>
-      <w:r>
-        <w:t xml:space="preserve">Soft Signals (corroboration only — can never trigger a lead alone): </w:t>
+        <w:t>Layer 3 - Source Verification: Three tiers. Official filings carry full weight. Credible press (FT, Bloomberg, BBC, PRWeek etc.) and multi-source corroboration earn strong weight. Lone unconfirmed scrapes are heavily discounted</w:t>
       </w:r>
     </w:p>
     <w:p>
+      <w:pPr>
+        <w:pStyle w:val="ListBullet"/>
+      </w:pPr>
       <w:r>
-        <w:rPr>
-          <w:b/>
-        </w:rPr>
-        <w:t xml:space="preserve">Layer 2 — Ideal Timing: </w:t>
-      </w:r>
-      <w:r>
-        <w:t>Ensures the call happens at the right moment. Leadership changes stay meaningful for ~90 days; event signals decay within weeks. A “too-fresh hold” prevents calling a brand-new CEO in their first 21 days — a new leader rarely has a hiring plan for 8 to 12 weeks.</w:t>
+        <w:t>Layer 4 - Financial Health: Cross-references growth language against cut language. Conflicting signals automatically downgrade a lead to "watch"</w:t>
       </w:r>
     </w:p>
     <w:p>
+      <w:pPr>
+        <w:pStyle w:val="ListBullet"/>
+      </w:pPr>
       <w:r>
-        <w:rPr>
-          <w:b/>
-        </w:rPr>
-        <w:t xml:space="preserve">Layer 3 — Source Verification (3 tiers): </w:t>
-      </w:r>
-      <w:r>
-        <w:t>Prioritises ironclad official sources (Companies House, London Stock Exchange, regulatory filings) at full weight. Credible outlets (Financial Times, Bloomberg, Reuters, BBC, Sky News, The Times, Telegraph, Guardian, PRWeek, Campaign, Marketing Week, TechCrunch) and multi-source corroboration earn strong weight. Lone, unconfirmed scrapes are heavily discounted so a rumour can never drive a call.</w:t>
+        <w:t>Layer 5 - Likelihood to Use an Agency: Detects in-house talent teams, "no agencies" language and closed PSLs as anti-signals. Detects retained search history, PSL membership and aged job clusters with no recruiter as pro-signals</w:t>
       </w:r>
     </w:p>
     <w:p>
+      <w:pPr>
+        <w:pStyle w:val="ListBullet"/>
+      </w:pPr>
       <w:r>
-        <w:rPr>
-          <w:b/>
-        </w:rPr>
-        <w:t xml:space="preserve">Layer 4 — Financial Health: </w:t>
-      </w:r>
-      <w:r>
-        <w:t>Evaluates whether a company is expanding or contracting by cross-referencing growth language (funding, expansion, new offices, contract wins) against cut language (redundancies, hiring freezes, cost-cutting, profit warnings). If signals conflict, the lead is automatically downgraded to “watch.” Exception: when redundancy IS the trigger, cuts are the signal, not a contradiction — redundancy programmes always need communications support.</w:t>
+        <w:t>Layer 6 - Market Health: Adjusts strictness by sector using real UK economic indices, auto-updated monthly. In expanding sectors, two corroborating layers are enough. In contracting sectors, the bar rises to three</w:t>
       </w:r>
     </w:p>
     <w:p>
+      <w:pPr>
+        <w:pStyle w:val="ListBullet"/>
+      </w:pPr>
       <w:r>
-        <w:rPr>
-          <w:b/>
-        </w:rPr>
-        <w:t xml:space="preserve">Layer 5 — Likelihood to Use an Agency: </w:t>
-      </w:r>
-      <w:r>
-        <w:t>Analyses whether a company relies on an internal talent team or has a historical preference for executive search firms. Detects in-house TA teams, “no agencies” language, RPO arrangements, and closed PSLs as anti-signals. Detects retained search history, PSL membership, and aged job clusters with no in-house recruiter as pro-signals. A company with roles open beyond the average time-to-fill and no recruiter in sight is a strong external indicator.</w:t>
-      </w:r>
-    </w:p>
-    <w:p>
-      <w:r>
-        <w:rPr>
-          <w:b/>
-        </w:rPr>
-        <w:t xml:space="preserve">Layer 6 — Broader Market Health (auto-updated monthly): </w:t>
-      </w:r>
-      <w:r>
-        <w:t>Adjusts strictness based on real UK economic indices. In expanding sectors (e.g. technology, pharma/healthcare), two corroborating layers are enough for a strong lead. In contracting sectors (e.g. retail/consumer), the bar rises to three layers — because companies in a cold market freeze, absorb hiring in-house, and cut budgets. The system tracks 11 individual sector readings so a funded tech scale-up is never penalised by a weak retail market.</w:t>
-      </w:r>
-    </w:p>
-    <w:p>
-      <w:r>
-        <w:rPr>
-          <w:b/>
-        </w:rPr>
-        <w:t xml:space="preserve">Layer 7 — Opportunity Size: </w:t>
-      </w:r>
-      <w:r>
-        <w:t>Categorises whether the opportunity is a lone executive search, a multi-signal build-out, or an entire team restructuring. Consultants pitch these very differently and budget their time accordingly.</w:t>
+        <w:t>Layer 7 - Opportunity Size: Categorises each lead as a single executive search, a multi-signal build-out or a full team restructuring</w:t>
       </w:r>
     </w:p>
     <w:p>
@@ -710,12 +354,12 @@
         <w:rPr>
           <w:color w:val="1B2A4A"/>
         </w:rPr>
-        <w:t>4. Automatic Filters, Anti-Triggers &amp; Hard Blockers</w:t>
+        <w:t>Automatic Blockers and Negative Scoring</w:t>
       </w:r>
     </w:p>
     <w:p>
       <w:r>
-        <w:t>To protect consultant time, the system applies negative scoring and automatic blockers to suppress bad leads:</w:t>
+        <w:t>The system suppresses bad leads so consultants never waste time or look out of touch:</w:t>
       </w:r>
     </w:p>
     <w:p>
@@ -723,13 +367,7 @@
         <w:pStyle w:val="ListBullet"/>
       </w:pPr>
       <w:r>
-        <w:rPr>
-          <w:b/>
-        </w:rPr>
-        <w:t>Hard block. If a company announces a freeze, all leads for that company are parked immediately.</w:t>
-      </w:r>
-      <w:r>
-        <w:t xml:space="preserve">Hiring Freeze: </w:t>
+        <w:t>Hiring freeze or administration - Hard block, lead is parked immediately</w:t>
       </w:r>
     </w:p>
     <w:p>
@@ -737,13 +375,7 @@
         <w:pStyle w:val="ListBullet"/>
       </w:pPr>
       <w:r>
-        <w:rPr>
-          <w:b/>
-        </w:rPr>
-        <w:t>Hard block. A company entering administration is not an actionable BD lead.</w:t>
-      </w:r>
-      <w:r>
-        <w:t xml:space="preserve">Administration / Insolvency: </w:t>
+        <w:t>Competitor recruiter detected - Hard block, can never rank above "Monitor"</w:t>
       </w:r>
     </w:p>
     <w:p>
@@ -751,13 +383,7 @@
         <w:pStyle w:val="ListBullet"/>
       </w:pPr>
       <w:r>
-        <w:rPr>
-          <w:b/>
-        </w:rPr>
-        <w:t>Hard block. Rival recruitment/staffing firms are detected automatically and can never rank above “Monitor,” so a competitor’s own hiring never outranks a real client target.</w:t>
-      </w:r>
-      <w:r>
-        <w:t xml:space="preserve">Competitor Recruiter: </w:t>
+        <w:t>Exclusive competitor lock - Heavy suppression</w:t>
       </w:r>
     </w:p>
     <w:p>
@@ -765,13 +391,7 @@
         <w:pStyle w:val="ListBullet"/>
       </w:pPr>
       <w:r>
-        <w:rPr>
-          <w:b/>
-        </w:rPr>
-        <w:t>Significant suppression. A company that has recently built an in-house comms function is unlikely to use an agency.</w:t>
-      </w:r>
-      <w:r>
-        <w:t xml:space="preserve">In-House Team Built: </w:t>
+        <w:t>In-house team recently built - Significant suppression</w:t>
       </w:r>
     </w:p>
     <w:p>
@@ -779,27 +399,7 @@
         <w:pStyle w:val="ListBullet"/>
       </w:pPr>
       <w:r>
-        <w:rPr>
-          <w:b/>
-        </w:rPr>
-        <w:t>Heavy suppression. A search exclusively retained by a rival agency is not worth pursuing.</w:t>
-      </w:r>
-      <w:r>
-        <w:t xml:space="preserve">Competitor Lock: </w:t>
-      </w:r>
-    </w:p>
-    <w:p>
-      <w:pPr>
-        <w:pStyle w:val="ListBullet"/>
-      </w:pPr>
-      <w:r>
-        <w:rPr>
-          <w:b/>
-        </w:rPr>
-        <w:t>Contradicts growth signals. A trigger sitting beside layoffs is downgraded to “watch” rather than “call.”</w:t>
-      </w:r>
-      <w:r>
-        <w:t xml:space="preserve">Layoffs / Budget Cuts: </w:t>
+        <w:t>Layoffs contradicting growth signals - Downgraded to "watch"</w:t>
       </w:r>
     </w:p>
     <w:p>
@@ -810,12 +410,12 @@
         <w:rPr>
           <w:color w:val="1B2A4A"/>
         </w:rPr>
-        <w:t>5. Clear Prioritisation &amp; Actionable Routing</w:t>
+        <w:t>How Leads are Prioritised</w:t>
       </w:r>
     </w:p>
     <w:p>
       <w:r>
-        <w:t>The platform takes all this complex market intelligence and distils it into five clear, actionable strength bands:</w:t>
+        <w:t>Every qualified lead is sorted into one of five action bands:</w:t>
       </w:r>
     </w:p>
     <w:p>
@@ -823,13 +423,7 @@
         <w:pStyle w:val="ListBullet"/>
       </w:pPr>
       <w:r>
-        <w:rPr>
-          <w:b/>
-        </w:rPr>
-        <w:t>Multiple corroborated signals pointing the same way, no contradiction, and the company fits the target market. This is a live opportunity to win.</w:t>
-      </w:r>
-      <w:r>
-        <w:t xml:space="preserve">Strong — Call Today: </w:t>
+        <w:t>Strong / Call Today - Multiple corroborated signals, no contradiction, strong market fit</w:t>
       </w:r>
     </w:p>
     <w:p>
@@ -837,13 +431,7 @@
         <w:pStyle w:val="ListBullet"/>
       </w:pPr>
       <w:r>
-        <w:rPr>
-          <w:b/>
-        </w:rPr>
-        <w:t>A real trigger with some corroboration, but not yet enough independent layers to be certain. Prepare the approach and watch for the build-out.</w:t>
-      </w:r>
-      <w:r>
-        <w:t xml:space="preserve">Promising — Nurture / Prepare: </w:t>
+        <w:t>Promising / Nurture - A real trigger with partial corroboration, not yet enough to be certain</w:t>
       </w:r>
     </w:p>
     <w:p>
@@ -851,13 +439,7 @@
         <w:pStyle w:val="ListBullet"/>
       </w:pPr>
       <w:r>
-        <w:rPr>
-          <w:b/>
-        </w:rPr>
-        <w:t>A quality trigger that has only just landed (e.g. a CEO appointed last week). Prepare now, call when the hiring plan forms.</w:t>
-      </w:r>
-      <w:r>
-        <w:t xml:space="preserve">Premature — Nurture: </w:t>
+        <w:t>Premature / Prepare - A quality trigger that has only just landed; prepare now, call when the plan forms</w:t>
       </w:r>
     </w:p>
     <w:p>
@@ -865,13 +447,7 @@
         <w:pStyle w:val="ListBullet"/>
       </w:pPr>
       <w:r>
-        <w:rPr>
-          <w:b/>
-        </w:rPr>
-        <w:t>Conflicting signals. The trigger is real but contradicted by other evidence. Keep an eye on it.</w:t>
-      </w:r>
-      <w:r>
-        <w:t xml:space="preserve">Watch — Monitor: </w:t>
+        <w:t>Watch / Monitor - Conflicting signals; keep an eye on it</w:t>
       </w:r>
     </w:p>
     <w:p>
@@ -879,13 +455,7 @@
         <w:pStyle w:val="ListBullet"/>
       </w:pPr>
       <w:r>
-        <w:rPr>
-          <w:b/>
-        </w:rPr>
-        <w:t>Hard-blocked by a freeze, administration, or competitor lock. Not actionable.</w:t>
-      </w:r>
-      <w:r>
-        <w:t xml:space="preserve">Parked — Monitor: </w:t>
+        <w:t>Parked / Monitor - Hard-blocked by a freeze, administration or competitor lock</w:t>
       </w:r>
     </w:p>
     <w:p>
@@ -896,100 +466,76 @@
         <w:rPr>
           <w:color w:val="1B2A4A"/>
         </w:rPr>
-        <w:t>6. Built-In Intelligence Tools</w:t>
+        <w:t>Built-In Intelligence Tools</w:t>
       </w:r>
     </w:p>
     <w:p>
       <w:r>
-        <w:t>Beyond the core lead engine, the platform features a suite of bespoke intelligence tools designed for targeted client acquisition:</w:t>
+        <w:t>Beyond core lead generation, the BD Leads section includes a suite of specialist tools:</w:t>
       </w:r>
     </w:p>
     <w:p>
+      <w:pPr>
+        <w:pStyle w:val="ListBullet"/>
+      </w:pPr>
       <w:r>
-        <w:rPr>
-          <w:b/>
-        </w:rPr>
-        <w:t xml:space="preserve">The “Hiring-Gap” Finder: </w:t>
-      </w:r>
-      <w:r>
-        <w:t>Identifies rapidly scaling companies that have completely overlooked their communications function — they’re hiring across the board but have zero comms roles. This lets the consultant pitch a solution before the company even realises they have a problem.</w:t>
+        <w:t>Hiring-Gap Finder - Identifies companies scaling heavily with zero communications roles, so we can pitch before they realise they have a problem</w:t>
       </w:r>
     </w:p>
     <w:p>
+      <w:pPr>
+        <w:pStyle w:val="ListBullet"/>
+      </w:pPr>
       <w:r>
-        <w:rPr>
-          <w:b/>
-        </w:rPr>
-        <w:t xml:space="preserve">The “Seniority-Gap” Detector: </w:t>
-      </w:r>
-      <w:r>
-        <w:t>Flags when a company brings on a new senior leader who inherits a junior-only team — a textbook indicator that they will want to recruit trusted senior lieutenants.</w:t>
+        <w:t>Seniority-Gap Detector - Flags when a new senior leader inherits a junior-only team, indicating they will recruit senior lieutenants</w:t>
       </w:r>
     </w:p>
     <w:p>
+      <w:pPr>
+        <w:pStyle w:val="ListBullet"/>
+      </w:pPr>
       <w:r>
-        <w:rPr>
-          <w:b/>
-        </w:rPr>
-        <w:t xml:space="preserve">Press-Release Velocity Spikes: </w:t>
-      </w:r>
-      <w:r>
-        <w:t>Tracks every company’s press output over a rolling 90-day baseline. When output triples, it signals the company is actively building its corporate communications capability — and likely needs senior people to sustain it.</w:t>
+        <w:t>Press-Release Velocity Spikes - Tracks each company's press output over a 90-day baseline and flags when it triples, signalling a comms capability build</w:t>
       </w:r>
     </w:p>
     <w:p>
+      <w:pPr>
+        <w:pStyle w:val="ListBullet"/>
+      </w:pPr>
       <w:r>
-        <w:rPr>
-          <w:b/>
-        </w:rPr>
-        <w:t xml:space="preserve">Competitor Mandate Tracking (“Mandates Worth Stealing”): </w:t>
-      </w:r>
-      <w:r>
-        <w:t>Monitors live mandates being handled by rival agencies. When a role has sat unfilled for 60+ days (adjusted by source — 50 days for private-sector ATS postings, 100 days for public-sector roles that are slow by design), the client is typically open to a second agency, an off-piste candidate, or a fee renegotiation. The system provides a daily hit-list of stalled competitor mandates.</w:t>
+        <w:t>Competitor Mandate Tracking - Monitors rival agencies' live mandates and surfaces those sitting unfilled beyond the expected timeframe, indicating the client may be open to a second agency</w:t>
       </w:r>
     </w:p>
     <w:p>
+      <w:pPr>
+        <w:pStyle w:val="ListBullet"/>
+      </w:pPr>
       <w:r>
-        <w:rPr>
-          <w:b/>
-        </w:rPr>
-        <w:t xml:space="preserve">Framework Displacement Detector: </w:t>
-      </w:r>
-      <w:r>
-        <w:t>When an incumbent recruitment or comms agency on a major framework suffers a disruption — data breach, mass turnover, losing preferred-supplier status, regulatory action, or major client loss — the framework client still has hiring volume but their primary vehicle has stalled. The system flags the window to approach the procurement head.</w:t>
+        <w:t>Framework Displacement Detector - Flags when an incumbent agency on a major framework suffers a disruption (data breach, regulatory action, major client loss), creating a window to approach the procurement head</w:t>
       </w:r>
     </w:p>
     <w:p>
+      <w:pPr>
+        <w:pStyle w:val="ListBullet"/>
+      </w:pPr>
       <w:r>
-        <w:rPr>
-          <w:b/>
-        </w:rPr>
-        <w:t xml:space="preserve">Budget-Flush / Year-End Detector: </w:t>
-      </w:r>
-      <w:r>
-        <w:t>Looks up each company’s fiscal year-end via Companies House and flags when they enter their final quarter. Unspent headcount or agency budget is at risk of being clawed back by finance — hiring managers are highly incentivised to sign contracts before year-end. This overlay tags existing leads so the consultant can frame the conversation around budget urgency.</w:t>
+        <w:t>Budget-Flush Detector - Looks up each company's fiscal year-end and flags when they enter their final quarter, when unspent headcount budget is at risk of being clawed back</w:t>
       </w:r>
     </w:p>
     <w:p>
+      <w:pPr>
+        <w:pStyle w:val="ListBullet"/>
+      </w:pPr>
       <w:r>
-        <w:rPr>
-          <w:b/>
-        </w:rPr>
-        <w:t xml:space="preserve">Water Special-Administration Watch: </w:t>
-      </w:r>
-      <w:r>
-        <w:t>As described in the lead types above — a bespoke, high-precision detector anchored to the fixed universe of ∼17 regulated water companies in England &amp; Wales. Detects both live SAR events and early financial-resilience warning signals that precede them by weeks.</w:t>
+        <w:t>Water Special-Administration Watch - Bespoke coverage of the 17 regulated water companies, detecting SAR events and the financial-resilience warnings that precede them</w:t>
       </w:r>
     </w:p>
     <w:p>
+      <w:pPr>
+        <w:pStyle w:val="ListBullet"/>
+      </w:pPr>
       <w:r>
-        <w:rPr>
-          <w:b/>
-        </w:rPr>
-        <w:t xml:space="preserve">Contract-End &amp; Re-Tender Windows: </w:t>
-      </w:r>
-      <w:r>
-        <w:t>Proactive detection of contracts approaching expiry, months before any public contract-loss announcement. Both the incumbent and the contracting authority are potential leads.</w:t>
+        <w:t>Contract-End and Re-Tender Windows - Proactive detection of contracts approaching expiry, months before any disclosure</w:t>
       </w:r>
     </w:p>
     <w:p>
@@ -1000,23 +546,12 @@
         <w:rPr>
           <w:color w:val="1B2A4A"/>
         </w:rPr>
-        <w:t>7. Contact Enrichment &amp; “Who to Call” Intelligence</w:t>
+        <w:t>Who to Call and What to Say</w:t>
       </w:r>
     </w:p>
     <w:p>
       <w:r>
-        <w:t>The system does not just identify that a company is a lead — it resolves the specific person to call, based on the nature of the trigger:</w:t>
-      </w:r>
-    </w:p>
-    <w:p>
-      <w:r>
-        <w:rPr>
-          <w:b/>
-        </w:rPr>
-        <w:t xml:space="preserve">Trigger-Specific Buyer Mapping (26 routes): </w:t>
-      </w:r>
-      <w:r>
-        <w:t>Every trigger type maps to the specific decision-maker who owns the hiring budget for that scenario. For example:</w:t>
+        <w:t>The system does not just identify that a company is a lead. It tells the consultant exactly who to call and why.</w:t>
       </w:r>
     </w:p>
     <w:p>
@@ -1024,94 +559,7 @@
         <w:pStyle w:val="ListBullet"/>
       </w:pPr>
       <w:r>
-        <w:rPr>
-          <w:b/>
-        </w:rPr>
-        <w:t>CHRO change → CCO / CEO office (HR runs process)</w:t>
-      </w:r>
-      <w:r/>
-    </w:p>
-    <w:p>
-      <w:pPr>
-        <w:pStyle w:val="ListBullet"/>
-      </w:pPr>
-      <w:r>
-        <w:rPr>
-          <w:b/>
-        </w:rPr>
-        <w:t>Funding round → CEO / CFO</w:t>
-      </w:r>
-      <w:r/>
-    </w:p>
-    <w:p>
-      <w:pPr>
-        <w:pStyle w:val="ListBullet"/>
-      </w:pPr>
-      <w:r>
-        <w:rPr>
-          <w:b/>
-        </w:rPr>
-        <w:t>Redundancy programme → CHRO / Head of Internal Comms (“redundancy comms almost always goes external”)</w:t>
-      </w:r>
-      <w:r/>
-    </w:p>
-    <w:p>
-      <w:pPr>
-        <w:pStyle w:val="ListBullet"/>
-      </w:pPr>
-      <w:r>
-        <w:rPr>
-          <w:b/>
-        </w:rPr>
-        <w:t>Hiring gap → CEO / CHRO (“no comms function exists yet”)</w:t>
-      </w:r>
-      <w:r/>
-    </w:p>
-    <w:p>
-      <w:pPr>
-        <w:pStyle w:val="ListBullet"/>
-      </w:pPr>
-      <w:r>
-        <w:rPr>
-          <w:b/>
-        </w:rPr>
-        <w:t>Seniority gap → The new CCO / Head of Comms directly</w:t>
-      </w:r>
-      <w:r/>
-    </w:p>
-    <w:p>
-      <w:pPr>
-        <w:pStyle w:val="ListBullet"/>
-      </w:pPr>
-      <w:r>
-        <w:rPr>
-          <w:b/>
-        </w:rPr>
-        <w:t>Crisis event → CEO office / Corporate Affairs</w:t>
-      </w:r>
-      <w:r/>
-    </w:p>
-    <w:p>
-      <w:pPr>
-        <w:pStyle w:val="ListBullet"/>
-      </w:pPr>
-      <w:r>
-        <w:rPr>
-          <w:b/>
-        </w:rPr>
-        <w:t>IPO/listing → CFO / Head of Investor Relations</w:t>
-      </w:r>
-      <w:r/>
-    </w:p>
-    <w:p>
-      <w:r>
-        <w:rPr>
-          <w:b/>
-        </w:rPr>
-        <w:t xml:space="preserve">Multi-Source Contact Resolution: </w:t>
-      </w:r>
-      <w:r>
-        <w:t>The system resolves named individuals, not just job titles, through a layered pipeline:</w:t>
+        <w:t>26 trigger-to-buyer routes - Every trigger type maps to the specific decision-maker. For example: CHRO change routes to CCO/CEO office, funding routes to CEO/CFO, redundancy routes to CHRO/Head of Internal Comms, hiring gap routes to CEO/CHRO</w:t>
       </w:r>
     </w:p>
     <w:p>
@@ -1119,13 +567,7 @@
         <w:pStyle w:val="ListBullet"/>
       </w:pPr>
       <w:r>
-        <w:rPr>
-          <w:b/>
-        </w:rPr>
-        <w:t>Seeded contacts (VMA’s hand-curated relationship data — highest priority)</w:t>
-      </w:r>
-      <w:r>
-        <w:t xml:space="preserve">1. </w:t>
+        <w:t>Named contacts, not just titles - Resolved through VMA's relationship data, Companies House officer records, LinkedIn profiles and RNS announcements</w:t>
       </w:r>
     </w:p>
     <w:p>
@@ -1133,13 +575,7 @@
         <w:pStyle w:val="ListBullet"/>
       </w:pPr>
       <w:r>
-        <w:rPr>
-          <w:b/>
-        </w:rPr>
-        <w:t>Companies House officer records (auto-refreshed daily, auto-expires stale contacts)</w:t>
-      </w:r>
-      <w:r>
-        <w:t xml:space="preserve">2. </w:t>
+        <w:t>Warm vs Cold tagging - Every lead is tagged based on whether VMA has an existing contact on file for that account</w:t>
       </w:r>
     </w:p>
     <w:p>
@@ -1147,13 +583,7 @@
         <w:pStyle w:val="ListBullet"/>
       </w:pPr>
       <w:r>
-        <w:rPr>
-          <w:b/>
-        </w:rPr>
-        <w:t>LinkedIn profile resolution (finds direct profile URLs for top leads)</w:t>
-      </w:r>
-      <w:r>
-        <w:t xml:space="preserve">3. </w:t>
+        <w:t>Access angle - A ready-made opening line based on the trigger: "A new leader has just landed, so the supplier relationship is open" or "A senior build-out usually follows a move of this size, before the role is briefed out"</w:t>
       </w:r>
     </w:p>
     <w:p>
@@ -1161,24 +591,7 @@
         <w:pStyle w:val="ListBullet"/>
       </w:pPr>
       <w:r>
-        <w:rPr>
-          <w:b/>
-        </w:rPr>
-        <w:t>RNS announcement parsing (extracts named individuals from regulatory news)</w:t>
-      </w:r>
-      <w:r>
-        <w:t xml:space="preserve">4. </w:t>
-      </w:r>
-    </w:p>
-    <w:p>
-      <w:r>
-        <w:rPr>
-          <w:b/>
-        </w:rPr>
-        <w:t xml:space="preserve">Warm vs Cold Access: </w:t>
-      </w:r>
-      <w:r>
-        <w:t>Every lead is tagged as “warm” (VMA has an existing contact on file for that account) or “cold” (no prior relationship). This is the single most important thing before a BD call. Alongside this, the system generates an access angle based on the trigger type:</w:t>
+        <w:t>"Why Now" narrative - Every high-priority lead gets a concise summary articulating the full picture, not a single trigger. Ready-made talking points before the consultant picks up the phone</w:t>
       </w:r>
     </w:p>
     <w:p>
@@ -1186,95 +599,7 @@
         <w:pStyle w:val="ListBullet"/>
       </w:pPr>
       <w:r>
-        <w:rPr>
-          <w:b/>
-        </w:rPr>
-        <w:t>Leadership change: “A new leader has just landed, so the supplier relationship is open.”</w:t>
-      </w:r>
-      <w:r/>
-    </w:p>
-    <w:p>
-      <w:pPr>
-        <w:pStyle w:val="ListBullet"/>
-      </w:pPr>
-      <w:r>
-        <w:rPr>
-          <w:b/>
-        </w:rPr>
-        <w:t>Demand trigger: “A senior build-out usually follows a move of this size, before the role is briefed out.”</w:t>
-      </w:r>
-      <w:r/>
-    </w:p>
-    <w:p>
-      <w:pPr>
-        <w:pStyle w:val="ListBullet"/>
-      </w:pPr>
-      <w:r>
-        <w:rPr>
-          <w:b/>
-        </w:rPr>
-        <w:t>Access trigger: “A live RFP / platform re-tender is underway.”</w:t>
-      </w:r>
-      <w:r/>
-    </w:p>
-    <w:p>
-      <w:pPr>
-        <w:pStyle w:val="Heading2"/>
-      </w:pPr>
-      <w:r>
-        <w:rPr>
-          <w:color w:val="1B2A4A"/>
-        </w:rPr>
-        <w:t>8. Tailored “Why Now” Narratives &amp; Pitch Packs</w:t>
-      </w:r>
-    </w:p>
-    <w:p>
-      <w:r>
-        <w:t>Every high-priority lead automatically generates two things:</w:t>
-      </w:r>
-    </w:p>
-    <w:p>
-      <w:r>
-        <w:rPr>
-          <w:b/>
-        </w:rPr>
-        <w:t xml:space="preserve">A “Why Now” Narrative: </w:t>
-      </w:r>
-      <w:r>
-        <w:t>A concise, human-readable summary explaining exactly why the company is actionable today. This is not a single-trigger heuristic — it articulates the full conjunction of signals. For example:</w:t>
-      </w:r>
-    </w:p>
-    <w:p>
-      <w:pPr>
-        <w:pStyle w:val="ListBullet"/>
-      </w:pPr>
-      <w:r>
-        <w:rPr>
-          <w:i/>
-        </w:rPr>
-        <w:t>“New CHRO at Anglian Water, and the signals point the same way. It stacks with growth funding the build and no in-house recruiter in sight. This reads as a team build heading to an agency, so Head of Corporate Communications is winnable now. Worth a call.”</w:t>
-      </w:r>
-    </w:p>
-    <w:p>
-      <w:pPr>
-        <w:pStyle w:val="ListBullet"/>
-      </w:pPr>
-      <w:r>
-        <w:rPr>
-          <w:i/>
-        </w:rPr>
-        <w:t>“CEO change at Thames Water has only just landed. A new leader rarely has a hiring plan for 8 to 12 weeks, so prepare the approach now and make contact when the plan forms.”</w:t>
-      </w:r>
-    </w:p>
-    <w:p>
-      <w:r>
-        <w:rPr>
-          <w:b/>
-        </w:rPr>
-        <w:t xml:space="preserve">An AI-Generated Pitch Pack: </w:t>
-      </w:r>
-      <w:r>
-        <w:t>A tailored retained-search pitch document for each account, covering: company snapshot (from Companies House), the “why now” case, cost-of-vacancy analysis, comparable employers, salary benchmarks (maintained monthly across 12 comms and 12 marketing role bands), candidate landscape overview, and VMA’s six-week methodology.</w:t>
+        <w:t>Pitch Pack generation - A tailored retained-search pitch document for any account, covering company snapshot, the "why now" case, cost-of-vacancy analysis, salary benchmarks, candidate landscape and methodology</w:t>
       </w:r>
     </w:p>
     <w:p>
@@ -1285,12 +610,12 @@
         <w:rPr>
           <w:color w:val="1B2A4A"/>
         </w:rPr>
-        <w:t>9. Dual-Desk Support: Communications &amp; Marketing</w:t>
+        <w:t>Precision Filtering</w:t>
       </w:r>
     </w:p>
     <w:p>
       <w:r>
-        <w:t>The entire engine runs in parallel for two desks with separate, tailored configurations:</w:t>
+        <w:t>The system is tuned to surface only roles VMA can place:</w:t>
       </w:r>
     </w:p>
     <w:p>
@@ -1298,13 +623,7 @@
         <w:pStyle w:val="ListBullet"/>
       </w:pPr>
       <w:r>
-        <w:rPr>
-          <w:b/>
-        </w:rPr>
-        <w:t>IR/regulator/governance triggers score highest. Buyer maps route to CCO, Corporate Affairs, Head of Comms. Role keywords cover internal comms, corporate affairs, PR, media relations, investor relations.</w:t>
-      </w:r>
-      <w:r>
-        <w:t xml:space="preserve">Communications Desk: </w:t>
+        <w:t>18 canonical search queries from Chief Communications Officer down to Employee Communications Manager, ordered by seniority</w:t>
       </w:r>
     </w:p>
     <w:p>
@@ -1312,18 +631,23 @@
         <w:pStyle w:val="ListBullet"/>
       </w:pPr>
       <w:r>
-        <w:rPr>
-          <w:b/>
-        </w:rPr>
-        <w:t>Funding scores highest (it’s the marketing master trigger — growth budgets fund brand and demand-gen). Rebrand and agency account moves score much higher. Buyer maps route to CMO, Marketing Director, Head of Brand. The marketing desk drops comms-only triggers (e.g. IR director changes) so the leads stay relevant.</w:t>
-      </w:r>
-      <w:r>
-        <w:t xml:space="preserve">Marketing Desk: </w:t>
+        <w:t>Hard exclusions for agency client-service roles, sales roles, ambiguous CCO titles (Compliance/Commercial/Customer), and all interim, temporary, secondment and fixed-term roles</w:t>
       </w:r>
     </w:p>
     <w:p>
+      <w:pPr>
+        <w:pStyle w:val="ListBullet"/>
+      </w:pPr>
       <w:r>
-        <w:t>Each desk has its own role keywords, job-search queries, salary floors, company exclusion lists, and trigger weightings — the same infrastructure, completely different commercial logic.</w:t>
+        <w:t>Salary floor of 40,000 pounds permanent</w:t>
+      </w:r>
+    </w:p>
+    <w:p>
+      <w:pPr>
+        <w:pStyle w:val="ListBullet"/>
+      </w:pPr>
+      <w:r>
+        <w:t>Company exclusions for VMA itself, all named competitor search firms, agencies posting on behalf of hidden clients, and generalist recruiters confirmed leaking through aggregator feeds</w:t>
       </w:r>
     </w:p>
     <w:p>
@@ -1334,105 +658,12 @@
         <w:rPr>
           <w:color w:val="1B2A4A"/>
         </w:rPr>
-        <w:t>10. Precision Role Filtering</w:t>
+        <w:t>Dual-Desk Support</w:t>
       </w:r>
     </w:p>
     <w:p>
       <w:r>
-        <w:t>The system is meticulously tuned to surface only roles VMA can place:</w:t>
-      </w:r>
-    </w:p>
-    <w:p>
-      <w:r>
-        <w:rPr>
-          <w:b/>
-        </w:rPr>
-        <w:t xml:space="preserve">18 Canonical Search Queries: </w:t>
-      </w:r>
-      <w:r>
-        <w:t>From Chief Communications Officer down to Employee Communications Manager, ordered by seniority. Budget-capped sources take the highest-value slice first.</w:t>
-      </w:r>
-    </w:p>
-    <w:p>
-      <w:r>
-        <w:rPr>
-          <w:b/>
-        </w:rPr>
-        <w:t xml:space="preserve">Hard Exclusions (Off-Product): </w:t>
-      </w:r>
-      <w:r>
-        <w:t>The system automatically filters out:</w:t>
-      </w:r>
-    </w:p>
-    <w:p>
-      <w:pPr>
-        <w:pStyle w:val="ListBullet"/>
-      </w:pPr>
-      <w:r>
-        <w:rPr>
-          <w:b/>
-        </w:rPr>
-        <w:t>Agency client-service roles (Account Director, Client Services, Client Partner)</w:t>
-      </w:r>
-      <w:r/>
-    </w:p>
-    <w:p>
-      <w:pPr>
-        <w:pStyle w:val="ListBullet"/>
-      </w:pPr>
-      <w:r>
-        <w:rPr>
-          <w:b/>
-        </w:rPr>
-        <w:t>Sales roles (Account Executive, Account Manager)</w:t>
-      </w:r>
-      <w:r/>
-    </w:p>
-    <w:p>
-      <w:pPr>
-        <w:pStyle w:val="ListBullet"/>
-      </w:pPr>
-      <w:r>
-        <w:rPr>
-          <w:b/>
-        </w:rPr>
-        <w:t>Ambiguous CCO titles (Chief Compliance / Commercial / Customer Officer)</w:t>
-      </w:r>
-      <w:r/>
-    </w:p>
-    <w:p>
-      <w:pPr>
-        <w:pStyle w:val="ListBullet"/>
-      </w:pPr>
-      <w:r>
-        <w:rPr>
-          <w:b/>
-        </w:rPr>
-        <w:t>Interim, temporary, secondment, maternity cover, and fixed-term roles — VMA’s specialism is executive search and permanent recruitment, not interim staffing</w:t>
-      </w:r>
-      <w:r/>
-    </w:p>
-    <w:p>
-      <w:pPr>
-        <w:pStyle w:val="ListBullet"/>
-      </w:pPr>
-      <w:r>
-        <w:rPr>
-          <w:b/>
-        </w:rPr>
-        <w:t>Roles below £40,000 permanent salary</w:t>
-      </w:r>
-      <w:r/>
-    </w:p>
-    <w:p>
-      <w:r>
-        <w:rPr>
-          <w:b/>
-        </w:rPr>
-        <w:t xml:space="preserve">Company Exclusions: </w:t>
-      </w:r>
-      <w:r>
-        <w:t>VMA Group itself, all named competitor search firms (Hanson Search, Sapience, Ellwood Atfield, Reuben Sinclair, CommsSearch, PRfect Search, Madigan Search, Quill Recruitment, Major Players), agencies known to post on behalf of hidden clients (EquiTalent, Harris Hill), and generalist recruiters confirmed leaking through aggregator feeds (Michael Page, NFP People, SF Partners). A broader regex catches the long tail of “...Recruitment/Search/Staffing/Talent Solutions...” agency names.</w:t>
+        <w:t>The entire engine runs in parallel for two desks with completely separate configurations. The Communications desk weights IR, regulator and governance triggers highest and routes to CCO, Corporate Affairs and Head of Comms. The Marketing desk weights funding highest and routes to CMO, Marketing Director and Head of Brand. Each desk has its own role keywords, search queries, company exclusions and trigger weightings.</w:t>
       </w:r>
     </w:p>
     <w:p>
@@ -1443,15 +674,7 @@
         <w:rPr>
           <w:color w:val="1B2A4A"/>
         </w:rPr>
-        <w:t>11. Lead Lifecycle &amp; Dashboard Management</w:t>
-      </w:r>
-    </w:p>
-    <w:p>
-      <w:r>
-        <w:rPr>
-          <w:b/>
-        </w:rPr>
-        <w:t xml:space="preserve">Triage Statuses: </w:t>
+        <w:t>Lead Lifecycle Management</w:t>
       </w:r>
     </w:p>
     <w:p>
@@ -1459,13 +682,7 @@
         <w:pStyle w:val="ListBullet"/>
       </w:pPr>
       <w:r>
-        <w:rPr>
-          <w:b/>
-        </w:rPr>
-        <w:t>Default — on the board, awaiting action.</w:t>
-      </w:r>
-      <w:r>
-        <w:t xml:space="preserve">Active: </w:t>
+        <w:t>Triage statuses - Active (on the board), Followed Up (90-day retention), Dismissed (30-day retention)</w:t>
       </w:r>
     </w:p>
     <w:p>
@@ -1473,13 +690,7 @@
         <w:pStyle w:val="ListBullet"/>
       </w:pPr>
       <w:r>
-        <w:rPr>
-          <w:b/>
-        </w:rPr>
-        <w:t>The consultant’s working record. Extended to 90-day retention.</w:t>
-      </w:r>
-      <w:r>
-        <w:t xml:space="preserve">Followed Up: </w:t>
+        <w:t>Outcome tracking - Every lead can be marked Called, Converted or Dead, building the data to refine scoring over time</w:t>
       </w:r>
     </w:p>
     <w:p>
@@ -1487,43 +698,7 @@
         <w:pStyle w:val="ListBullet"/>
       </w:pPr>
       <w:r>
-        <w:rPr>
-          <w:b/>
-        </w:rPr>
-        <w:t>Parked. Clears on the standard 30-day clock.</w:t>
-      </w:r>
-      <w:r>
-        <w:t xml:space="preserve">Dismissed: </w:t>
-      </w:r>
-    </w:p>
-    <w:p>
-      <w:r>
-        <w:rPr>
-          <w:b/>
-        </w:rPr>
-        <w:t xml:space="preserve">Outcome Tracking (Calibration): </w:t>
-      </w:r>
-      <w:r>
-        <w:t>Every lead can be marked as Called, Converted, or Dead, with the engine’s full score snapshot preserved at the moment of the outcome. This creates the data to calibrate and refine the scoring weights over time. Until 50+ outcomes are logged, scores are flagged as provisional.</w:t>
-      </w:r>
-    </w:p>
-    <w:p>
-      <w:r>
-        <w:rPr>
-          <w:b/>
-        </w:rPr>
-        <w:t xml:space="preserve">Permanent Suppression (Tombstoning): </w:t>
-      </w:r>
-      <w:r>
-        <w:t>When a consultant removes a lead entirely, the company is permanently suppressed by normalised name — so “OQC” and “Oxford Quantum Circuits” can’t slip back in under a variant, even if a fresh event re-detects the same company on a later morning brief.</w:t>
-      </w:r>
-    </w:p>
-    <w:p>
-      <w:r>
-        <w:rPr>
-          <w:b/>
-        </w:rPr>
-        <w:t>Automatic Retention &amp; Expiry:</w:t>
+        <w:t>Permanent suppression - When a lead is removed entirely, the company is blocked by normalised name so variants cannot slip back in</w:t>
       </w:r>
     </w:p>
     <w:p>
@@ -1531,51 +706,7 @@
         <w:pStyle w:val="ListBullet"/>
       </w:pPr>
       <w:r>
-        <w:rPr>
-          <w:b/>
-        </w:rPr>
-        <w:t>Live Jobs: 7-day window from the real post date (with drift protection for sources like LinkedIn that stamp the scrape time, not the real date)</w:t>
-      </w:r>
-      <w:r/>
-    </w:p>
-    <w:p>
-      <w:pPr>
-        <w:pStyle w:val="ListBullet"/>
-      </w:pPr>
-      <w:r>
-        <w:rPr>
-          <w:b/>
-        </w:rPr>
-        <w:t>BD Leads (predictors, funding, cascade): 30 days default / 90 days if followed up</w:t>
-      </w:r>
-      <w:r/>
-    </w:p>
-    <w:p>
-      <w:pPr>
-        <w:pStyle w:val="ListBullet"/>
-      </w:pPr>
-      <w:r>
-        <w:rPr>
-          <w:b/>
-        </w:rPr>
-        <w:t>Tombstone pruning after 60 days absent (keeps the state files bounded)</w:t>
-      </w:r>
-      <w:r/>
-    </w:p>
-    <w:p>
-      <w:pPr>
-        <w:pStyle w:val="Heading2"/>
-      </w:pPr>
-      <w:r>
-        <w:rPr>
-          <w:color w:val="1B2A4A"/>
-        </w:rPr>
-        <w:t>12. Contacts Auto-Maintenance</w:t>
-      </w:r>
-    </w:p>
-    <w:p>
-      <w:r>
-        <w:t>The system doesn’t just find leads — it actively maintains VMA’s contact intelligence:</w:t>
+        <w:t>Automatic expiry - Live jobs clear after 7 days, BD leads after 30 days (90 if followed up), with drift protection for sources that stamp scrape times instead of real post dates</w:t>
       </w:r>
     </w:p>
     <w:p>
@@ -1583,41 +714,7 @@
         <w:pStyle w:val="ListBullet"/>
       </w:pPr>
       <w:r>
-        <w:rPr>
-          <w:b/>
-        </w:rPr>
-        <w:t>Daily polling detects when a director departs or a new one is appointed. If a seeded contact has left the company, their record is automatically expired so the consultant isn’t calling someone who’s already gone. If a new officer is appointed, the contact record is populated.</w:t>
-      </w:r>
-      <w:r>
-        <w:t xml:space="preserve">Companies House Officer-Change Scan: </w:t>
-      </w:r>
-    </w:p>
-    <w:p>
-      <w:pPr>
-        <w:pStyle w:val="ListBullet"/>
-      </w:pPr>
-      <w:r>
-        <w:rPr>
-          <w:b/>
-        </w:rPr>
-        <w:t>Stale contacts are flagged for re-verification.</w:t>
-      </w:r>
-      <w:r>
-        <w:t xml:space="preserve">Contact Reverification: </w:t>
-      </w:r>
-    </w:p>
-    <w:p>
-      <w:pPr>
-        <w:pStyle w:val="ListBullet"/>
-      </w:pPr>
-      <w:r>
-        <w:rPr>
-          <w:b/>
-        </w:rPr>
-        <w:t>Coverage measurement across the watchlist — how many target companies have a named, verified contact vs. gaps to fill.</w:t>
-      </w:r>
-      <w:r>
-        <w:t xml:space="preserve">Contact Audit: </w:t>
+        <w:t>Contacts auto-maintenance - Daily Companies House scans expire departed contacts and populate new ones. Stale contacts are flagged for re-verification</w:t>
       </w:r>
     </w:p>
     <w:p>
@@ -1628,12 +725,7 @@
         <w:rPr>
           <w:color w:val="1B2A4A"/>
         </w:rPr>
-        <w:t>13. Candidate-Side Intelligence (Signal Drift)</w:t>
-      </w:r>
-    </w:p>
-    <w:p>
-      <w:r>
-        <w:t>The system also ranks passive candidates not by when they were last called, but by whether the world is signalling they’re movable right now:</w:t>
+        <w:t>Daily Delivery</w:t>
       </w:r>
     </w:p>
     <w:p>
@@ -1641,13 +733,7 @@
         <w:pStyle w:val="ListBullet"/>
       </w:pPr>
       <w:r>
-        <w:rPr>
-          <w:b/>
-        </w:rPr>
-        <w:t>Ramps at the 24/36/48-month thresholds — the published senior-tenure sweet spots where candidates are most likely to move.</w:t>
-      </w:r>
-      <w:r>
-        <w:t xml:space="preserve">Tenure Clock: </w:t>
+        <w:t>Morning brief email at 08:55 UK time, Monday to Friday (Monday covers the weekend). Only genuinely new leads, never duplicates</w:t>
       </w:r>
     </w:p>
     <w:p>
@@ -1655,13 +741,7 @@
         <w:pStyle w:val="ListBullet"/>
       </w:pPr>
       <w:r>
-        <w:rPr>
-          <w:b/>
-        </w:rPr>
-        <w:t>If the candidate’s current employer appears in a cascade event (leadership change, restructure), their team is in flux — they’re more likely to be receptive.</w:t>
-      </w:r>
-      <w:r>
-        <w:t xml:space="preserve">Cascade Proximity: </w:t>
+        <w:t>Live dashboard showing the full pipeline across all seven lead types with sub-filters, search and triage actions</w:t>
       </w:r>
     </w:p>
     <w:p>
@@ -1669,103 +749,7 @@
         <w:pStyle w:val="ListBullet"/>
       </w:pPr>
       <w:r>
-        <w:rPr>
-          <w:b/>
-        </w:rPr>
-        <w:t>A senior comms person showing up in news is a personal-brand visibility uptick — often a precursor to a move.</w:t>
-      </w:r>
-      <w:r>
-        <w:t xml:space="preserve">News &amp; Trade-Press Mentions: </w:t>
-      </w:r>
-    </w:p>
-    <w:p>
-      <w:pPr>
-        <w:pStyle w:val="ListBullet"/>
-      </w:pPr>
-      <w:r>
-        <w:rPr>
-          <w:b/>
-        </w:rPr>
-        <w:t>Still factored in, but reduced in weight so a genuinely movable candidate outranks a cold one who’s simply overdue for a call.</w:t>
-      </w:r>
-      <w:r>
-        <w:t xml:space="preserve">Cadence Overdue: </w:t>
-      </w:r>
-    </w:p>
-    <w:p>
-      <w:pPr>
-        <w:pStyle w:val="Heading2"/>
-      </w:pPr>
-      <w:r>
-        <w:rPr>
-          <w:color w:val="1B2A4A"/>
-        </w:rPr>
-        <w:t>14. Daily Delivery &amp; Dashboard</w:t>
-      </w:r>
-    </w:p>
-    <w:p>
-      <w:r>
-        <w:rPr>
-          <w:b/>
-        </w:rPr>
-        <w:t xml:space="preserve">Morning Brief Email: </w:t>
-      </w:r>
-      <w:r>
-        <w:t>Delivered at 08:55 UK time, Monday to Friday. Monday’s brief covers Saturday, Sunday and Monday. Contains only genuinely new leads (de-duplicated against everything already sent) so the consultant is never spammed with the same items. If there’s nothing new, no email is sent.</w:t>
-      </w:r>
-    </w:p>
-    <w:p>
-      <w:r>
-        <w:rPr>
-          <w:b/>
-        </w:rPr>
-        <w:t xml:space="preserve">Live Dashboard: </w:t>
-      </w:r>
-      <w:r>
-        <w:t>A real-time web dashboard showing the full pipeline across all seven lead types, with sub-filters (Active / New Today / Followed Up / Dismissed / All), search, triage actions, and direct links to LinkedIn profiles, Companies House records, and source articles.</w:t>
-      </w:r>
-    </w:p>
-    <w:p>
-      <w:r>
-        <w:rPr>
-          <w:b/>
-        </w:rPr>
-        <w:t xml:space="preserve">Pitch Pack Generation: </w:t>
-      </w:r>
-      <w:r>
-        <w:t>On-demand generation of a tailored retained-search pitch for any account, delivered by email or downloaded as an artifact.</w:t>
-      </w:r>
-    </w:p>
-    <w:p>
-      <w:r>
-        <w:rPr>
-          <w:b/>
-        </w:rPr>
-        <w:t xml:space="preserve">Pre-Meeting Brief: </w:t>
-      </w:r>
-      <w:r>
-        <w:t>On-demand account-specific intelligence for meeting preparation — recent triggers, likely upcoming needs, and the recommended pitch angle.</w:t>
-      </w:r>
-    </w:p>
-    <w:p>
-      <w:pPr>
-        <w:pStyle w:val="Heading2"/>
-      </w:pPr>
-      <w:r>
-        <w:rPr>
-          <w:color w:val="1B2A4A"/>
-        </w:rPr>
-        <w:t>Summary of Business Impact</w:t>
-      </w:r>
-    </w:p>
-    <w:p>
-      <w:r>
-        <w:t>This platform transforms business development from a reactive daily chore into a proactive, data-driven strategy. It scours 30+ data sources across the internet every morning, qualifies every opportunity through a rigorous 7-layer screen, detects 33 distinct trigger types, applies negative scoring to suppress bad leads, resolves the specific person to call, adapts to live market conditions by sector, and generates a ready-made pitch — all before the consultant picks up the phone.</w:t>
-      </w:r>
-    </w:p>
-    <w:p>
-      <w:r>
-        <w:t>It acts as a BD consultant that never sleeps, ensuring the team focuses 100% of their energy on everything the business requires from first contact onwards.</w:t>
+        <w:t>On-demand pitch pack and pre-meeting brief generation for any account</w:t>
       </w:r>
     </w:p>
     <w:sectPr>
@@ -2141,6 +1125,9 @@
     <w:name w:val="Normal"/>
     <w:qFormat/>
     <w:rsid w:val="00FC693F"/>
+    <w:pPr>
+      <w:spacing w:after="120"/>
+    </w:pPr>
     <w:rPr>
       <w:rFonts w:ascii="Calibri" w:hAnsi="Calibri"/>
       <w:sz w:val="22"/>

</xml_diff>